<commit_message>
Entrega final parcial 2
- Correcciones H-01 (C10/C15 e IOrquestacionAnalitica) y H-02 (dimensión sistema/proceso/producto) en informe y Excel
- Literal A: CUC, bicolumnar y estados R15; literales C/D: deployment simplificado y escenarios QAW
- PDFs exportados y zip de entrega en Entrega/
- .gitignore para .bak_*, .lck y temporales de Office

Co-Authored-By: Claude Opus 5.5 <noreply@anthropic.com>
Claude-Session: https://claude.ai/code/session_0189PyZp59tnBWGhCrS4AwU2
</commit_message>
<xml_diff>
--- a/informe.docx
+++ b/informe.docx
@@ -208,6 +208,20 @@
           <w:szCs w:val="20"/>
         </w:rPr>
         <w:t xml:space="preserve">Resultado de la clasificación: 15 requerimientos = 10 RF, 3 RNF y 2 de proceso (R5 y R15); 11 son RAS.</w:t>
+      </w:r>
+    </w:p>
+    <w:p>
+      <w:pPr>
+        <w:spacing w:after="100" w:before="0"/>
+        <w:jc w:val="both"/>
+      </w:pPr>
+      <w:r>
+        <w:rPr>
+          <w:rFonts w:ascii="Arial" w:cs="Arial" w:eastAsia="Arial" w:hAnsi="Arial"/>
+          <w:sz w:val="20"/>
+          <w:szCs w:val="20"/>
+        </w:rPr>
+        <w:t xml:space="preserve">Dimensión Sistema / Proceso / Producto: R5 y R15 son requerimientos de proceso (cómo se desarrolla y valida el diseño). Los 13 restantes son de producto, y las columnas Hw, Red y Sw de la Tabla 1 indican qué pilares del sistema involucra cada uno: R1, R11 y R13 son requerimientos de sistema completo, porque comprometen a la vez hardware (medidores, terminales), redes (NB-IoT/4G, RF Mesh) y software; R2 es la restricción ergonómica de hardware.</w:t>
       </w:r>
     </w:p>
     <w:p>
@@ -29964,7 +29978,7 @@
                 <w:sz w:val="17"/>
                 <w:szCs w:val="17"/>
               </w:rPr>
-              <w:t xml:space="preserve">• Calcular el estado de cada elemento (normal, advertencia, corte, sospecha de fraude) desde lecturas y eventos activos</w:t>
+              <w:t xml:space="preserve">• Calcular el estado de cada elemento (normal, advertencia, corte, sospecha de fraude) desde lecturas, eventos activos y el último % de pérdidas no técnicas del balance (C15)</w:t>
             </w:r>
           </w:p>
           <w:p>
@@ -30058,6 +30072,21 @@
                 <w:szCs w:val="17"/>
               </w:rPr>
               <w:t xml:space="preserve">• IAutorizacion (C20 AutorizadorAcceso)</w:t>
+            </w:r>
+          </w:p>
+          <w:p>
+            <w:pPr>
+              <w:keepNext/>
+              <w:spacing w:after="20"/>
+              <w:jc w:val="left"/>
+            </w:pPr>
+            <w:r>
+              <w:rPr>
+                <w:rFonts w:ascii="Arial" w:cs="Arial" w:eastAsia="Arial" w:hAnsi="Arial"/>
+                <w:sz w:val="17"/>
+                <w:szCs w:val="17"/>
+              </w:rPr>
+              <w:t xml:space="preserve">• IOrquestacionAnalitica (C15 OrquestadorAnaliticaPerdidas)</w:t>
             </w:r>
           </w:p>
         </w:tc>
@@ -31674,7 +31703,7 @@
                 <w:sz w:val="17"/>
                 <w:szCs w:val="17"/>
               </w:rPr>
-              <w:t xml:space="preserve">• Entregar los resultados a la consola</w:t>
+              <w:t xml:space="preserve">• Entregar los resultados a la consola y el % de pérdidas al mapa (C10)</w:t>
             </w:r>
           </w:p>
         </w:tc>
@@ -37057,7 +37086,7 @@
                 <w:sz w:val="17"/>
                 <w:szCs w:val="17"/>
               </w:rPr>
-              <w:t xml:space="preserve">ConsolaWebCOD</w:t>
+              <w:t xml:space="preserve">ConsolaWebCOD, ServicioMapaRed</w:t>
             </w:r>
           </w:p>
         </w:tc>

</xml_diff>